<commit_message>
IJBM v2 finishing pass: remove harvesting/mechanistic language, rebuild v2 package
- 'harvesting' fully removed; lag deficit described as short-term temporal
  displacement in aggregate crash mortality / temporal redistribution
- 'heat-exposed road users' -> substantially larger associations among
  open-air road users; cover letter and keywords recalibrated
- affiliation audit: canonical 'Shiga University of Medical Science' DSAI
  affiliation uniform across all project files, propagated unchanged
- all canonical numbers verified unchanged; no analysis rerun
- IJBM_submission_FINAL_v2/ + zip + FINAL_FINISHING_HANDOFF.md

Co-Authored-By: Tatsuki Onishi <bougtoir@gmail.com>
</commit_message>
<xml_diff>
--- a/output/manuscript/ijbm_main_inline.docx
+++ b/output/manuscript/ijbm_main_inline.docx
@@ -51,7 +51,7 @@
         <w:spacing w:after="120" w:line="480" w:lineRule="auto"/>
       </w:pPr>
       <w:r>
-        <w:t>Prior studies have linked heat and heat waves to road crashes, including fatal crashes, but less is known about locally unusual heat relative to seasonal norms, its lag structure, and the mortality burden involved. We fitted quasi-Poisson distributed-lag models relating daily mean-temperature anomalies (departures from each spatial unit's day-of-year climatology) to traffic-crash deaths in US state-day (Fatality Analysis Reporting System, 2016-2022; 272,586 deaths) and Japanese prefecture-day (National Police Agency, 2019-2024; 11,576 deaths) panels. In the US, a +9 °C anomaly was associated with higher same-day mortality (rate ratio 1.165, 95% CI 1.135-1.196), followed by a 1-3 day deficit consistent with partial short-term displacement; the cumulative 0-10 day rate ratio was 1.076 (1.017-1.139). The excess was much larger for open-air road users (motorcyclists, pedestrians, cyclists) than for vehicle occupants. Model-based net heat-attributable mortality was about 528 deaths per year (1.36% of crash deaths), numerically similar to officially coded direct-heat mortality, although the two measures represent different constructs. Japanese estimates were imprecise and did not provide clear replication. Days that are unusually hot for the local season are associated with an acute excess of US crash mortality concentrated in heat-exposed road users.</w:t>
+        <w:t>Prior studies have linked heat and heat waves to road crashes, including fatal crashes, but less is known about locally unusual heat relative to seasonal norms, its lag structure, and the mortality burden involved. We fitted quasi-Poisson distributed-lag models relating daily mean-temperature anomalies (departures from each spatial unit's day-of-year climatology) to traffic-crash deaths in US state-day (Fatality Analysis Reporting System, 2016-2022; 272,586 deaths) and Japanese prefecture-day (National Police Agency, 2019-2024; 11,576 deaths) panels. In the US, a +9 °C anomaly was associated with higher same-day mortality (rate ratio 1.165, 95% CI 1.135-1.196), followed by a 1-3 day deficit consistent with short-term temporal displacement in aggregate crash mortality; the cumulative 0-10 day rate ratio was 1.076 (1.017-1.139). The excess was much larger for open-air road users (motorcyclists, pedestrians, cyclists) than for vehicle occupants. Model-based net heat-attributable mortality was about 528 deaths per year (1.36% of crash deaths), numerically similar to officially coded direct-heat mortality, although the two measures represent different constructs. Japanese estimates were imprecise and did not provide clear replication. Days that are unusually hot for the local season are associated with an acute excess of US crash mortality, with substantially larger associations among open-air road users.</w:t>
       </w:r>
     </w:p>
     <w:p>
@@ -59,7 +59,7 @@
         <w:spacing w:after="120" w:line="480" w:lineRule="auto"/>
       </w:pPr>
       <w:r>
-        <w:t>Keywords: temperature anomaly; extreme heat; traffic-crash mortality; distributed-lag model; vulnerable road users; biometeorology</w:t>
+        <w:t>Keywords: temperature anomaly; extreme heat; traffic-crash mortality; distributed-lag model; road-user heterogeneity; biometeorology</w:t>
       </w:r>
     </w:p>
     <w:p>
@@ -83,7 +83,7 @@
         <w:spacing w:after="120" w:line="480" w:lineRule="auto"/>
       </w:pPr>
       <w:r>
-        <w:t>Three aspects of this relationship remain less well characterised. First, most prior studies used absolute temperature or fixed heat-wave thresholds; how locally unusual heat—departures from the seasonal conditions to which populations and travel behaviour are adapted—relates to crash mortality has received less attention, even though anomaly-based metrics are central to biometeorological studies of heat-health relationships. Second, the temporal structure of the association—whether an acute excess is followed by compensating deficits (short-term displacement or 'harvesting')—has rarely been decomposed for crash mortality, leaving open whether heat adds deaths or advances deaths that would have occurred soon anyway. Third, the population mortality burden attributable to such exposure, in deaths per year, has not been quantified at the national scale alongside the risk ratios that dominate the literature.</w:t>
+        <w:t>Three aspects of this relationship remain less well characterised. First, most prior studies used absolute temperature or fixed heat-wave thresholds; how locally unusual heat—departures from the seasonal conditions to which populations and travel behaviour are adapted—relates to crash mortality has received less attention, even though anomaly-based metrics are central to biometeorological studies of heat-health relationships. Second, the temporal structure of the association—whether an acute excess is followed by compensating deficits, i.e. a temporal redistribution pattern—has rarely been decomposed for crash mortality, leaving open whether the association adds deaths or reflects short-term displacement at the population level. Third, the population mortality burden attributable to such exposure, in deaths per year, has not been quantified at the national scale alongside the risk ratios that dominate the literature.</w:t>
       </w:r>
     </w:p>
     <w:p>
@@ -649,7 +649,7 @@
         <w:spacing w:after="120" w:line="480" w:lineRule="auto"/>
       </w:pPr>
       <w:r>
-        <w:t>Using the temperature anomaly as the exposure, days hotter than the seasonal norm carried higher crash mortality (Fig. 1). A +9 °C anomaly was associated with higher same-day crash deaths, RR 1.165 (95% CI 1.135-1.196). The lag structure showed an acute same-day excess followed by a deficit at 1-3 days, RR 0.936 (0.904-0.968), consistent with short-term displacement (harvesting) rather than a net addition of deaths at every lag (Fig. 2; Table 2); the cumulative 0-10 day RR was 1.076 (95% CI 1.017-1.139). The conclusion was not sensitive to the choice of contrast: same-day and cumulative RRs were similar at +5 °C and at the empirical 95th-percentile anomaly (Table S1).</w:t>
+        <w:t>Using the temperature anomaly as the exposure, days hotter than the seasonal norm carried higher crash mortality (Fig. 1). A +9 °C anomaly was associated with higher same-day crash deaths, RR 1.165 (95% CI 1.135-1.196). The lag structure showed an acute same-day excess followed by a deficit at 1-3 days, RR 0.936 (0.904-0.968), consistent with short-term temporal displacement in aggregate crash mortality rather than a net addition of deaths at every lag (Fig. 2; Table 2); the cumulative 0-10 day RR was 1.076 (95% CI 1.017-1.139). The conclusion was not sensitive to the choice of contrast: same-day and cumulative RRs were similar at +5 °C and at the empirical 95th-percentile anomaly (Table S1).</w:t>
       </w:r>
     </w:p>
     <w:p/>
@@ -758,7 +758,7 @@
         <w:t xml:space="preserve">Fig. 2 </w:t>
       </w:r>
       <w:r>
-        <w:t>United States lag structure of the crash-death response to a +9 °C anomaly: an acute same-day excess followed by a 1-3 day deficit consistent with short-term displacement (harvesting).</w:t>
+        <w:t>United States lag structure of the crash-death response to a +9 °C anomaly: an acute same-day excess followed by a 1-3 day deficit consistent with short-term temporal displacement in aggregate crash mortality.</w:t>
       </w:r>
     </w:p>
     <w:p/>
@@ -2195,7 +2195,7 @@
         <w:spacing w:after="120" w:line="480" w:lineRule="auto"/>
       </w:pPr>
       <w:r>
-        <w:t>Principal findings. A +9 °C temperature anomaly relative to the local seasonal norm was associated with a same-day rate ratio of 1.165 (95% CI 1.135-1.196) for US traffic-crash deaths. The excess was acute: the 1-3 day window showed a deficit consistent with short-term displacement, and the cumulative 0-10 day association was positive but smaller (RR 1.076 (95% CI 1.017-1.139)). The model-based net heat-attributable burden was 528 deaths per year, about 1.36% of crash deaths.</w:t>
+        <w:t>Principal findings. A +9 °C temperature anomaly relative to the local seasonal norm was associated with a same-day rate ratio of 1.165 (95% CI 1.135-1.196) for US traffic-crash deaths. The excess was acute: the 1-3 day window showed a deficit consistent with short-term temporal displacement, and the cumulative 0-10 day association was positive but smaller (RR 1.076 (95% CI 1.017-1.139)). The model-based net heat-attributable burden was 528 deaths per year, about 1.36% of crash deaths.</w:t>
       </w:r>
     </w:p>
     <w:p>
@@ -2203,7 +2203,7 @@
         <w:spacing w:after="120" w:line="480" w:lineRule="auto"/>
       </w:pPr>
       <w:r>
-        <w:t>Relationship to prior evidence. These findings are consistent with, and extend, an established literature linking heat to road crashes and crash mortality. A nationwide US case-crossover analysis found 3.4% more fatal crashes on heat-wave days(Wu et al. 2018); time-series studies reported more crashes and injuries at higher temperatures and during heat waves(Basagaña et al. 2015; Liang et al. 2021; Liang et al. 2022); and recent multi-city analyses documented higher road-traffic mortality on hot days, concentrated in motorcyclists, bicyclists and other vulnerable road users in Latin America(Hsu et al. 2025) and California(Hsu et al. 2026). Our results align with that evidence while adding three elements: an exposure metric defined relative to local seasonal conditions, a distributed-lag decomposition of acute versus displaced deaths, and a national attributable-burden estimate for fatal crashes.</w:t>
+        <w:t>Relationship to prior evidence. These findings are consistent with, and extend, an established literature linking heat to road crashes and crash mortality. A nationwide US case-crossover analysis found 3.4% more fatal crashes on heat-wave days(Wu et al. 2018); time-series studies reported more crashes and injuries at higher temperatures and during heat waves(Basagaña et al. 2015; Liang et al. 2021; Liang et al. 2022); and recent multi-city analyses documented higher road-traffic mortality on hot days, concentrated in motorcyclists, bicyclists and other vulnerable road users in Latin America(Hsu et al. 2025) and California(Hsu et al. 2026). Our results align with that evidence while adding three elements: an exposure metric defined relative to local seasonal conditions, a distributed-lag decomposition separating an acute excess from subsequent temporal displacement, and a national attributable-burden estimate for fatal crashes.</w:t>
       </w:r>
     </w:p>
     <w:p>
@@ -2251,7 +2251,7 @@
         <w:spacing w:after="120" w:line="480" w:lineRule="auto"/>
       </w:pPr>
       <w:r>
-        <w:t>Biometeorological and adaptation relevance. Within the biometeorology literature this study places traffic-crash mortality alongside other acute heat-health outcomes quantified with anomaly-based, distributed-lag methods, and identifies open-air road users as a group in whom heat exposure is occupational or behavioural rather than incidental. The harvesting pattern implies that the acute signal is larger than the net burden, which matters for the timing of heat-health warnings. Whether heat-targeted advisories for motorcyclists, cyclists, pedestrians and outdoor workers reduce crash risk is a testable hypothesis for intervention studies, not a conclusion of this analysis.</w:t>
+        <w:t>Biometeorological and adaptation relevance. Within the biometeorology literature this study places traffic-crash mortality alongside other acute heat-health outcomes quantified with anomaly-based, distributed-lag methods, and identifies open-air road users as a group in whom heat exposure is occupational or behavioural rather than incidental. The displacement pattern implies that the acute signal is larger than the net burden, which matters for the timing of heat-health warnings. Whether heat-targeted advisories for motorcyclists, cyclists, pedestrians and outdoor workers reduce crash risk is a testable hypothesis for intervention studies, not a conclusion of this analysis.</w:t>
       </w:r>
     </w:p>
     <w:p>
@@ -2267,7 +2267,7 @@
         <w:spacing w:after="120" w:line="480" w:lineRule="auto"/>
       </w:pPr>
       <w:r>
-        <w:t>Days that are unusually hot relative to the local seasonal norm were associated with an acute, same-day excess of US traffic-crash mortality, concentrated in open-air road users and followed by partial short-term displacement. The model-based attributable burden was of a similar numerical magnitude to officially coded direct-heat mortality, although the two constructs differ. A harmonized analysis in Japan was too imprecise to establish transportability. The results refine and extend prior evidence that heat is associated with road-crash mortality; they do not establish individual-level causation, and individual-level studies linking crash decedents to ambient heat exposure are needed.</w:t>
+        <w:t>Days that are unusually hot relative to the local seasonal norm were associated with an acute, same-day excess of US traffic-crash mortality, with substantially larger associations among open-air road users and followed by a short-term deficit compatible with temporal displacement at the population level. The model-based attributable burden was of a similar numerical magnitude to officially coded direct-heat mortality, although the two constructs differ. A harmonized analysis in Japan was too imprecise to establish transportability. The results refine and extend prior evidence that heat is associated with road-crash mortality; they do not establish individual-level causation, and individual-level studies linking crash decedents to ambient heat exposure are needed.</w:t>
       </w:r>
     </w:p>
     <w:p>

</xml_diff>